<commit_message>
feat: reject functionality active
</commit_message>
<xml_diff>
--- a/cv/ceevsa.docx
+++ b/cv/ceevsa.docx
@@ -138,8 +138,6 @@
           </wp:inline>
         </w:drawing>
       </w:r>
-      <w:bookmarkStart w:id="0" w:name="_GoBack"/>
-      <w:bookmarkEnd w:id="0"/>
     </w:p>
     <w:p>
       <w:pPr>
@@ -148,6 +146,8 @@
           <w:lang w:val="en-US"/>
         </w:rPr>
       </w:pPr>
+      <w:bookmarkStart w:id="0" w:name="_GoBack"/>
+      <w:bookmarkEnd w:id="0"/>
     </w:p>
     <w:p>
       <w:pPr>

</xml_diff>